<commit_message>
popravljen SSU dodavanje slike na izložbu
Change-Id: Ia976fa2db3005d0c398f3916f04d2414c4829a93
</commit_message>
<xml_diff>
--- a/SSU/Objavljivanje_rada_na_izložbi.docx
+++ b/SSU/Objavljivanje_rada_na_izložbi.docx
@@ -758,17 +758,10 @@
           <w:p>
             <w:pPr>
               <w:rPr>
+                <w:szCs w:val="28"/>
                 <w:lang w:val="sr-Latn-RS"/>
               </w:rPr>
             </w:pPr>
-            <w:r>
-              <w:rPr>
-                <w:rFonts w:ascii="Times New Roman" w:eastAsia="Times New Roman" w:hAnsi="Times New Roman" w:cs="Times New Roman"/>
-                <w:sz w:val="20"/>
-                <w:lang w:val="sr-Latn-RS"/>
-              </w:rPr>
-              <w:t xml:space="preserve"> </w:t>
-            </w:r>
           </w:p>
         </w:tc>
         <w:tc>
@@ -1175,7 +1168,7 @@
             </w:rPr>
             <w:fldChar w:fldCharType="separate"/>
           </w:r>
-          <w:hyperlink w:anchor="_Toc205843921" w:history="1">
+          <w:hyperlink w:anchor="_Toc205845211" w:history="1">
             <w:r>
               <w:rPr>
                 <w:rStyle w:val="Hyperlink"/>
@@ -1223,7 +1216,7 @@
                 <w:noProof/>
                 <w:webHidden/>
               </w:rPr>
-              <w:instrText xml:space="preserve"> PAGEREF _Toc205843921 \h </w:instrText>
+              <w:instrText xml:space="preserve"> PAGEREF _Toc205845211 \h </w:instrText>
             </w:r>
             <w:r>
               <w:rPr>
@@ -1268,7 +1261,7 @@
               <w:sz w:val="24"/>
             </w:rPr>
           </w:pPr>
-          <w:hyperlink w:anchor="_Toc205843922" w:history="1">
+          <w:hyperlink w:anchor="_Toc205845212" w:history="1">
             <w:r>
               <w:rPr>
                 <w:rStyle w:val="Hyperlink"/>
@@ -1316,7 +1309,7 @@
                 <w:noProof/>
                 <w:webHidden/>
               </w:rPr>
-              <w:instrText xml:space="preserve"> PAGEREF _Toc205843922 \h </w:instrText>
+              <w:instrText xml:space="preserve"> PAGEREF _Toc205845212 \h </w:instrText>
             </w:r>
             <w:r>
               <w:rPr>
@@ -1361,7 +1354,7 @@
               <w:sz w:val="24"/>
             </w:rPr>
           </w:pPr>
-          <w:hyperlink w:anchor="_Toc205843923" w:history="1">
+          <w:hyperlink w:anchor="_Toc205845213" w:history="1">
             <w:r>
               <w:rPr>
                 <w:rStyle w:val="Hyperlink"/>
@@ -1409,7 +1402,7 @@
                 <w:noProof/>
                 <w:webHidden/>
               </w:rPr>
-              <w:instrText xml:space="preserve"> PAGEREF _Toc205843923 \h </w:instrText>
+              <w:instrText xml:space="preserve"> PAGEREF _Toc205845213 \h </w:instrText>
             </w:r>
             <w:r>
               <w:rPr>
@@ -1454,7 +1447,7 @@
               <w:sz w:val="24"/>
             </w:rPr>
           </w:pPr>
-          <w:hyperlink w:anchor="_Toc205843924" w:history="1">
+          <w:hyperlink w:anchor="_Toc205845214" w:history="1">
             <w:r>
               <w:rPr>
                 <w:rStyle w:val="Hyperlink"/>
@@ -1502,7 +1495,7 @@
                 <w:noProof/>
                 <w:webHidden/>
               </w:rPr>
-              <w:instrText xml:space="preserve"> PAGEREF _Toc205843924 \h </w:instrText>
+              <w:instrText xml:space="preserve"> PAGEREF _Toc205845214 \h </w:instrText>
             </w:r>
             <w:r>
               <w:rPr>
@@ -1547,7 +1540,7 @@
               <w:sz w:val="24"/>
             </w:rPr>
           </w:pPr>
-          <w:hyperlink w:anchor="_Toc205843925" w:history="1">
+          <w:hyperlink w:anchor="_Toc205845215" w:history="1">
             <w:r>
               <w:rPr>
                 <w:rStyle w:val="Hyperlink"/>
@@ -1595,7 +1588,7 @@
                 <w:noProof/>
                 <w:webHidden/>
               </w:rPr>
-              <w:instrText xml:space="preserve"> PAGEREF _Toc205843925 \h </w:instrText>
+              <w:instrText xml:space="preserve"> PAGEREF _Toc205845215 \h </w:instrText>
             </w:r>
             <w:r>
               <w:rPr>
@@ -1640,7 +1633,7 @@
               <w:sz w:val="24"/>
             </w:rPr>
           </w:pPr>
-          <w:hyperlink w:anchor="_Toc205843926" w:history="1">
+          <w:hyperlink w:anchor="_Toc205845216" w:history="1">
             <w:r>
               <w:rPr>
                 <w:rStyle w:val="Hyperlink"/>
@@ -1688,7 +1681,7 @@
                 <w:noProof/>
                 <w:webHidden/>
               </w:rPr>
-              <w:instrText xml:space="preserve"> PAGEREF _Toc205843926 \h </w:instrText>
+              <w:instrText xml:space="preserve"> PAGEREF _Toc205845216 \h </w:instrText>
             </w:r>
             <w:r>
               <w:rPr>
@@ -1733,7 +1726,7 @@
               <w:sz w:val="24"/>
             </w:rPr>
           </w:pPr>
-          <w:hyperlink w:anchor="_Toc205843927" w:history="1">
+          <w:hyperlink w:anchor="_Toc205845217" w:history="1">
             <w:r>
               <w:rPr>
                 <w:rStyle w:val="Hyperlink"/>
@@ -1781,7 +1774,7 @@
                 <w:noProof/>
                 <w:webHidden/>
               </w:rPr>
-              <w:instrText xml:space="preserve"> PAGEREF _Toc205843927 \h </w:instrText>
+              <w:instrText xml:space="preserve"> PAGEREF _Toc205845217 \h </w:instrText>
             </w:r>
             <w:r>
               <w:rPr>
@@ -1826,7 +1819,7 @@
               <w:sz w:val="24"/>
             </w:rPr>
           </w:pPr>
-          <w:hyperlink w:anchor="_Toc205843928" w:history="1">
+          <w:hyperlink w:anchor="_Toc205845218" w:history="1">
             <w:r>
               <w:rPr>
                 <w:rStyle w:val="Hyperlink"/>
@@ -1874,7 +1867,7 @@
                 <w:noProof/>
                 <w:webHidden/>
               </w:rPr>
-              <w:instrText xml:space="preserve"> PAGEREF _Toc205843928 \h </w:instrText>
+              <w:instrText xml:space="preserve"> PAGEREF _Toc205845218 \h </w:instrText>
             </w:r>
             <w:r>
               <w:rPr>
@@ -1919,7 +1912,7 @@
               <w:sz w:val="24"/>
             </w:rPr>
           </w:pPr>
-          <w:hyperlink w:anchor="_Toc205843929" w:history="1">
+          <w:hyperlink w:anchor="_Toc205845219" w:history="1">
             <w:r>
               <w:rPr>
                 <w:rStyle w:val="Hyperlink"/>
@@ -1969,7 +1962,7 @@
                 <w:noProof/>
                 <w:webHidden/>
               </w:rPr>
-              <w:instrText xml:space="preserve"> PAGEREF _Toc205843929 \h </w:instrText>
+              <w:instrText xml:space="preserve"> PAGEREF _Toc205845219 \h </w:instrText>
             </w:r>
             <w:r>
               <w:rPr>
@@ -1990,6 +1983,101 @@
                 <w:webHidden/>
               </w:rPr>
               <w:t>4</w:t>
+            </w:r>
+            <w:r>
+              <w:rPr>
+                <w:noProof/>
+                <w:webHidden/>
+              </w:rPr>
+              <w:fldChar w:fldCharType="end"/>
+            </w:r>
+          </w:hyperlink>
+        </w:p>
+        <w:p>
+          <w:pPr>
+            <w:pStyle w:val="TOC3"/>
+            <w:tabs>
+              <w:tab w:val="left" w:pos="1680"/>
+              <w:tab w:val="right" w:pos="9894"/>
+            </w:tabs>
+            <w:rPr>
+              <w:rFonts w:asciiTheme="minorHAnsi" w:eastAsiaTheme="minorEastAsia" w:hAnsiTheme="minorHAnsi" w:cstheme="minorBidi"/>
+              <w:noProof/>
+              <w:color w:val="auto"/>
+              <w:sz w:val="24"/>
+            </w:rPr>
+          </w:pPr>
+          <w:hyperlink w:anchor="_Toc205845220" w:history="1">
+            <w:r>
+              <w:rPr>
+                <w:rStyle w:val="Hyperlink"/>
+                <w:rFonts w:eastAsiaTheme="majorEastAsia"/>
+                <w:i/>
+                <w:iCs/>
+                <w:noProof/>
+                <w:lang w:val="sr-Latn-RS"/>
+              </w:rPr>
+              <w:t>2.2.2</w:t>
+            </w:r>
+            <w:r>
+              <w:rPr>
+                <w:rFonts w:asciiTheme="minorHAnsi" w:eastAsiaTheme="minorEastAsia" w:hAnsiTheme="minorHAnsi" w:cstheme="minorBidi"/>
+                <w:noProof/>
+                <w:color w:val="auto"/>
+                <w:sz w:val="24"/>
+              </w:rPr>
+              <w:tab/>
+            </w:r>
+            <w:r>
+              <w:rPr>
+                <w:rStyle w:val="Hyperlink"/>
+                <w:rFonts w:eastAsiaTheme="majorEastAsia"/>
+                <w:i/>
+                <w:noProof/>
+                <w:lang w:val="sr-Latn-RS"/>
+              </w:rPr>
+              <w:t>Korisnik ne dodaje sliku u odgovarajuće polje a radi zahtev za slanje</w:t>
+            </w:r>
+            <w:r>
+              <w:rPr>
+                <w:noProof/>
+                <w:webHidden/>
+              </w:rPr>
+              <w:tab/>
+            </w:r>
+            <w:r>
+              <w:rPr>
+                <w:noProof/>
+                <w:webHidden/>
+              </w:rPr>
+              <w:fldChar w:fldCharType="begin"/>
+            </w:r>
+            <w:r>
+              <w:rPr>
+                <w:noProof/>
+                <w:webHidden/>
+              </w:rPr>
+              <w:instrText xml:space="preserve"> PAGEREF _Toc205845220 \h </w:instrText>
+            </w:r>
+            <w:r>
+              <w:rPr>
+                <w:noProof/>
+                <w:webHidden/>
+              </w:rPr>
+            </w:r>
+            <w:r>
+              <w:rPr>
+                <w:noProof/>
+                <w:webHidden/>
+              </w:rPr>
+              <w:fldChar w:fldCharType="separate"/>
+            </w:r>
+            <w:r>
+              <w:rPr>
+                <w:noProof/>
+                <w:webHidden/>
+              </w:rPr>
+              <w:t>5</w:t>
             </w:r>
             <w:r>
               <w:rPr>
@@ -2014,7 +2102,7 @@
               <w:sz w:val="24"/>
             </w:rPr>
           </w:pPr>
-          <w:hyperlink w:anchor="_Toc205843930" w:history="1">
+          <w:hyperlink w:anchor="_Toc205845221" w:history="1">
             <w:r>
               <w:rPr>
                 <w:rStyle w:val="Hyperlink"/>
@@ -2062,7 +2150,7 @@
                 <w:noProof/>
                 <w:webHidden/>
               </w:rPr>
-              <w:instrText xml:space="preserve"> PAGEREF _Toc205843930 \h </w:instrText>
+              <w:instrText xml:space="preserve"> PAGEREF _Toc205845221 \h </w:instrText>
             </w:r>
             <w:r>
               <w:rPr>
@@ -2107,7 +2195,7 @@
               <w:sz w:val="24"/>
             </w:rPr>
           </w:pPr>
-          <w:hyperlink w:anchor="_Toc205843931" w:history="1">
+          <w:hyperlink w:anchor="_Toc205845222" w:history="1">
             <w:r>
               <w:rPr>
                 <w:rStyle w:val="Hyperlink"/>
@@ -2155,7 +2243,7 @@
                 <w:noProof/>
                 <w:webHidden/>
               </w:rPr>
-              <w:instrText xml:space="preserve"> PAGEREF _Toc205843931 \h </w:instrText>
+              <w:instrText xml:space="preserve"> PAGEREF _Toc205845222 \h </w:instrText>
             </w:r>
             <w:r>
               <w:rPr>
@@ -2200,7 +2288,7 @@
               <w:sz w:val="24"/>
             </w:rPr>
           </w:pPr>
-          <w:hyperlink w:anchor="_Toc205843932" w:history="1">
+          <w:hyperlink w:anchor="_Toc205845223" w:history="1">
             <w:r>
               <w:rPr>
                 <w:rStyle w:val="Hyperlink"/>
@@ -2248,7 +2336,7 @@
                 <w:noProof/>
                 <w:webHidden/>
               </w:rPr>
-              <w:instrText xml:space="preserve"> PAGEREF _Toc205843932 \h </w:instrText>
+              <w:instrText xml:space="preserve"> PAGEREF _Toc205845223 \h </w:instrText>
             </w:r>
             <w:r>
               <w:rPr>
@@ -2336,7 +2424,7 @@
           <w:lang w:val="sr-Latn-RS"/>
         </w:rPr>
       </w:pPr>
-      <w:bookmarkStart w:id="0" w:name="_Toc205843921"/>
+      <w:bookmarkStart w:id="0" w:name="_Toc205845211"/>
       <w:r>
         <w:rPr>
           <w:lang w:val="sr-Latn-RS"/>
@@ -2359,7 +2447,7 @@
           <w:lang w:val="sr-Latn-RS"/>
         </w:rPr>
       </w:pPr>
-      <w:bookmarkStart w:id="1" w:name="_Toc205843922"/>
+      <w:bookmarkStart w:id="1" w:name="_Toc205845212"/>
       <w:r>
         <w:rPr>
           <w:lang w:val="sr-Latn-RS"/>
@@ -2437,7 +2525,7 @@
           <w:lang w:val="sr-Latn-RS"/>
         </w:rPr>
       </w:pPr>
-      <w:bookmarkStart w:id="2" w:name="_Toc205843923"/>
+      <w:bookmarkStart w:id="2" w:name="_Toc205845213"/>
       <w:r>
         <w:rPr>
           <w:lang w:val="sr-Latn-RS"/>
@@ -2489,7 +2577,7 @@
           <w:lang w:val="sr-Latn-RS"/>
         </w:rPr>
       </w:pPr>
-      <w:bookmarkStart w:id="3" w:name="_Toc205843924"/>
+      <w:bookmarkStart w:id="3" w:name="_Toc205845214"/>
       <w:r>
         <w:rPr>
           <w:lang w:val="sr-Latn-RS"/>
@@ -2815,7 +2903,7 @@
           <w:lang w:val="sr-Latn-RS"/>
         </w:rPr>
       </w:pPr>
-      <w:bookmarkStart w:id="4" w:name="_Toc205843925"/>
+      <w:bookmarkStart w:id="4" w:name="_Toc205845215"/>
       <w:r>
         <w:rPr>
           <w:lang w:val="sr-Latn-RS"/>
@@ -3468,7 +3556,7 @@
           <w:lang w:val="sr-Latn-RS"/>
         </w:rPr>
       </w:pPr>
-      <w:bookmarkStart w:id="5" w:name="_Toc205843926"/>
+      <w:bookmarkStart w:id="5" w:name="_Toc205845216"/>
       <w:r>
         <w:rPr>
           <w:lang w:val="sr-Latn-RS"/>
@@ -3514,7 +3602,7 @@
           <w:lang w:val="sr-Latn-RS"/>
         </w:rPr>
       </w:pPr>
-      <w:bookmarkStart w:id="6" w:name="_Toc205843927"/>
+      <w:bookmarkStart w:id="6" w:name="_Toc205845217"/>
       <w:r>
         <w:rPr>
           <w:u w:val="single" w:color="000000"/>
@@ -3622,7 +3710,7 @@
           <w:lang w:val="sr-Latn-RS"/>
         </w:rPr>
       </w:pPr>
-      <w:bookmarkStart w:id="7" w:name="_Toc205843928"/>
+      <w:bookmarkStart w:id="7" w:name="_Toc205845218"/>
       <w:r>
         <w:rPr>
           <w:u w:val="single" w:color="000000"/>
@@ -3661,7 +3749,7 @@
           <w:lang w:val="sr-Latn-RS"/>
         </w:rPr>
       </w:pPr>
-      <w:bookmarkStart w:id="8" w:name="_Toc205843929"/>
+      <w:bookmarkStart w:id="8" w:name="_Toc205845219"/>
       <w:r>
         <w:rPr>
           <w:i/>
@@ -3899,6 +3987,270 @@
     </w:p>
     <w:p>
       <w:pPr>
+        <w:spacing w:after="3" w:line="252" w:lineRule="auto"/>
+        <w:ind w:right="1291"/>
+        <w:rPr>
+          <w:rFonts w:ascii="Times New Roman" w:eastAsia="Times New Roman" w:hAnsi="Times New Roman" w:cs="Times New Roman"/>
+          <w:sz w:val="20"/>
+          <w:lang w:val="sr-Latn-RS"/>
+        </w:rPr>
+      </w:pPr>
+    </w:p>
+    <w:p>
+      <w:pPr>
+        <w:pStyle w:val="Heading3"/>
+        <w:spacing w:after="56"/>
+        <w:ind w:left="720" w:hanging="720"/>
+        <w:rPr>
+          <w:i/>
+          <w:u w:val="none"/>
+          <w:lang w:val="sr-Latn-RS"/>
+        </w:rPr>
+      </w:pPr>
+      <w:bookmarkStart w:id="9" w:name="_Toc205845220"/>
+      <w:r>
+        <w:rPr>
+          <w:i/>
+          <w:u w:val="none"/>
+          <w:lang w:val="sr-Latn-RS"/>
+        </w:rPr>
+        <w:lastRenderedPageBreak/>
+        <w:t xml:space="preserve">Korisnik </w:t>
+      </w:r>
+      <w:r>
+        <w:rPr>
+          <w:i/>
+          <w:u w:val="none"/>
+          <w:lang w:val="sr-Latn-RS"/>
+        </w:rPr>
+        <w:t>ne dodaje</w:t>
+      </w:r>
+      <w:r>
+        <w:rPr>
+          <w:i/>
+          <w:u w:val="none"/>
+          <w:lang w:val="sr-Latn-RS"/>
+        </w:rPr>
+        <w:t xml:space="preserve"> sliku </w:t>
+      </w:r>
+      <w:r>
+        <w:rPr>
+          <w:i/>
+          <w:u w:val="none"/>
+          <w:lang w:val="sr-Latn-RS"/>
+        </w:rPr>
+        <w:t>u odgovarajuće polje</w:t>
+      </w:r>
+      <w:r>
+        <w:rPr>
+          <w:i/>
+          <w:u w:val="none"/>
+          <w:lang w:val="sr-Latn-RS"/>
+        </w:rPr>
+        <w:t xml:space="preserve"> a radi zahtev za slanje</w:t>
+      </w:r>
+      <w:bookmarkEnd w:id="9"/>
+    </w:p>
+    <w:p>
+      <w:pPr>
+        <w:spacing w:after="3" w:line="252" w:lineRule="auto"/>
+        <w:ind w:left="-5" w:right="1291" w:hanging="10"/>
+        <w:rPr>
+          <w:rFonts w:ascii="Times New Roman" w:eastAsia="Times New Roman" w:hAnsi="Times New Roman" w:cs="Times New Roman"/>
+          <w:sz w:val="20"/>
+          <w:lang w:val="sr-Latn-RS"/>
+        </w:rPr>
+      </w:pPr>
+      <w:r>
+        <w:rPr>
+          <w:rFonts w:ascii="Times New Roman" w:eastAsia="Times New Roman" w:hAnsi="Times New Roman" w:cs="Times New Roman"/>
+          <w:sz w:val="20"/>
+          <w:lang w:val="sr-Latn-RS"/>
+        </w:rPr>
+        <w:t>Na ekranu se prikazuje forma</w:t>
+      </w:r>
+      <w:r>
+        <w:rPr>
+          <w:rFonts w:ascii="Times New Roman" w:eastAsia="Times New Roman" w:hAnsi="Times New Roman" w:cs="Times New Roman"/>
+          <w:sz w:val="20"/>
+          <w:lang w:val="sr-Latn-RS"/>
+        </w:rPr>
+        <w:t xml:space="preserve"> za dodavanje</w:t>
+      </w:r>
+      <w:r>
+        <w:rPr>
+          <w:rFonts w:ascii="Times New Roman" w:eastAsia="Times New Roman" w:hAnsi="Times New Roman" w:cs="Times New Roman"/>
+          <w:sz w:val="20"/>
+          <w:lang w:val="sr-Latn-RS"/>
+        </w:rPr>
+        <w:t xml:space="preserve"> koja sadrži p</w:t>
+      </w:r>
+      <w:r>
+        <w:rPr>
+          <w:rFonts w:ascii="Times New Roman" w:eastAsia="Times New Roman" w:hAnsi="Times New Roman" w:cs="Times New Roman"/>
+          <w:sz w:val="20"/>
+          <w:lang w:val="sr-Latn-RS"/>
+        </w:rPr>
+        <w:t xml:space="preserve">olje za unos datoteke </w:t>
+      </w:r>
+      <w:r>
+        <w:rPr>
+          <w:rFonts w:ascii="Times New Roman" w:eastAsia="Times New Roman" w:hAnsi="Times New Roman" w:cs="Times New Roman"/>
+          <w:sz w:val="20"/>
+          <w:lang w:val="sr-Latn-RS"/>
+        </w:rPr>
+        <w:t xml:space="preserve">i dugme </w:t>
+      </w:r>
+      <w:r>
+        <w:rPr>
+          <w:rFonts w:ascii="Times New Roman" w:eastAsia="Times New Roman" w:hAnsi="Times New Roman" w:cs="Times New Roman"/>
+          <w:sz w:val="20"/>
+          <w:lang w:val="sr-Latn-RS"/>
+        </w:rPr>
+        <w:t>za slanje</w:t>
+      </w:r>
+      <w:r>
+        <w:rPr>
+          <w:rFonts w:ascii="Times New Roman" w:eastAsia="Times New Roman" w:hAnsi="Times New Roman" w:cs="Times New Roman"/>
+          <w:sz w:val="20"/>
+          <w:lang w:val="sr-Latn-RS"/>
+        </w:rPr>
+        <w:t>.</w:t>
+      </w:r>
+    </w:p>
+    <w:p>
+      <w:pPr>
+        <w:pStyle w:val="ListParagraph"/>
+        <w:numPr>
+          <w:ilvl w:val="0"/>
+          <w:numId w:val="9"/>
+        </w:numPr>
+        <w:spacing w:after="3" w:line="252" w:lineRule="auto"/>
+        <w:ind w:right="1291"/>
+        <w:rPr>
+          <w:rFonts w:ascii="Times New Roman" w:eastAsia="Times New Roman" w:hAnsi="Times New Roman" w:cs="Times New Roman"/>
+          <w:sz w:val="20"/>
+          <w:lang w:val="sr-Latn-RS"/>
+        </w:rPr>
+      </w:pPr>
+      <w:r>
+        <w:rPr>
+          <w:rFonts w:ascii="Times New Roman" w:eastAsia="Times New Roman" w:hAnsi="Times New Roman" w:cs="Times New Roman"/>
+          <w:sz w:val="20"/>
+          <w:lang w:val="sr-Latn-RS"/>
+        </w:rPr>
+        <w:t xml:space="preserve">Korisnik </w:t>
+      </w:r>
+      <w:r>
+        <w:rPr>
+          <w:rFonts w:ascii="Times New Roman" w:eastAsia="Times New Roman" w:hAnsi="Times New Roman" w:cs="Times New Roman"/>
+          <w:sz w:val="20"/>
+          <w:lang w:val="sr-Latn-RS"/>
+        </w:rPr>
+        <w:t>nije dodao</w:t>
+      </w:r>
+      <w:r>
+        <w:rPr>
+          <w:rFonts w:ascii="Times New Roman" w:eastAsia="Times New Roman" w:hAnsi="Times New Roman" w:cs="Times New Roman"/>
+          <w:sz w:val="20"/>
+          <w:lang w:val="sr-Latn-RS"/>
+        </w:rPr>
+        <w:t xml:space="preserve"> datoteku u odgovarajuće polje.</w:t>
+      </w:r>
+    </w:p>
+    <w:p>
+      <w:pPr>
+        <w:pStyle w:val="ListParagraph"/>
+        <w:numPr>
+          <w:ilvl w:val="0"/>
+          <w:numId w:val="9"/>
+        </w:numPr>
+        <w:spacing w:after="3" w:line="252" w:lineRule="auto"/>
+        <w:ind w:right="1291"/>
+        <w:rPr>
+          <w:rFonts w:ascii="Times New Roman" w:eastAsia="Times New Roman" w:hAnsi="Times New Roman" w:cs="Times New Roman"/>
+          <w:sz w:val="20"/>
+          <w:lang w:val="sr-Latn-RS"/>
+        </w:rPr>
+      </w:pPr>
+      <w:r>
+        <w:rPr>
+          <w:rFonts w:ascii="Times New Roman" w:eastAsia="Times New Roman" w:hAnsi="Times New Roman" w:cs="Times New Roman"/>
+          <w:sz w:val="20"/>
+          <w:lang w:val="sr-Latn-RS"/>
+        </w:rPr>
+        <w:t xml:space="preserve">Klikom na dugme </w:t>
+      </w:r>
+      <w:r>
+        <w:rPr>
+          <w:rFonts w:ascii="Times New Roman" w:eastAsia="Times New Roman" w:hAnsi="Times New Roman" w:cs="Times New Roman"/>
+          <w:sz w:val="20"/>
+          <w:lang w:val="sr-Latn-RS"/>
+        </w:rPr>
+        <w:t>za slanje</w:t>
+      </w:r>
+      <w:r>
+        <w:rPr>
+          <w:rFonts w:ascii="Times New Roman" w:eastAsia="Times New Roman" w:hAnsi="Times New Roman" w:cs="Times New Roman"/>
+          <w:sz w:val="20"/>
+          <w:lang w:val="sr-Latn-RS"/>
+        </w:rPr>
+        <w:t xml:space="preserve">, </w:t>
+      </w:r>
+      <w:r>
+        <w:rPr>
+          <w:rFonts w:ascii="Times New Roman" w:eastAsia="Times New Roman" w:hAnsi="Times New Roman" w:cs="Times New Roman"/>
+          <w:sz w:val="20"/>
+          <w:lang w:val="sr-Latn-RS"/>
+        </w:rPr>
+        <w:t>korisnik šalje rad aplikaciji</w:t>
+      </w:r>
+      <w:r>
+        <w:rPr>
+          <w:rFonts w:ascii="Times New Roman" w:eastAsia="Times New Roman" w:hAnsi="Times New Roman" w:cs="Times New Roman"/>
+          <w:sz w:val="20"/>
+          <w:lang w:val="sr-Latn-RS"/>
+        </w:rPr>
+        <w:t>.</w:t>
+      </w:r>
+    </w:p>
+    <w:p>
+      <w:pPr>
+        <w:pStyle w:val="ListParagraph"/>
+        <w:numPr>
+          <w:ilvl w:val="0"/>
+          <w:numId w:val="10"/>
+        </w:numPr>
+        <w:spacing w:after="3" w:line="252" w:lineRule="auto"/>
+        <w:ind w:right="1291"/>
+        <w:rPr>
+          <w:rFonts w:ascii="Times New Roman" w:eastAsia="Times New Roman" w:hAnsi="Times New Roman" w:cs="Times New Roman"/>
+          <w:sz w:val="20"/>
+          <w:lang w:val="sr-Latn-RS"/>
+        </w:rPr>
+      </w:pPr>
+      <w:r>
+        <w:rPr>
+          <w:rFonts w:ascii="Times New Roman" w:eastAsia="Times New Roman" w:hAnsi="Times New Roman" w:cs="Times New Roman"/>
+          <w:sz w:val="20"/>
+          <w:lang w:val="sr-Latn-RS"/>
+        </w:rPr>
+        <w:t>Aplikacija ne menja prikaz i opominje korisnika da nije stavio datoteku za slanje.</w:t>
+      </w:r>
+    </w:p>
+    <w:p>
+      <w:pPr>
+        <w:spacing w:after="3" w:line="252" w:lineRule="auto"/>
+        <w:ind w:right="1291"/>
+        <w:rPr>
+          <w:rFonts w:ascii="Times New Roman" w:eastAsia="Times New Roman" w:hAnsi="Times New Roman" w:cs="Times New Roman"/>
+          <w:sz w:val="20"/>
+          <w:lang w:val="sr-Latn-RS"/>
+        </w:rPr>
+      </w:pPr>
+    </w:p>
+    <w:p>
+      <w:pPr>
         <w:spacing w:after="113"/>
         <w:rPr>
           <w:lang w:val="sr-Latn-RS"/>
@@ -3914,15 +4266,14 @@
           <w:lang w:val="sr-Latn-RS"/>
         </w:rPr>
       </w:pPr>
-      <w:bookmarkStart w:id="9" w:name="_Toc205843930"/>
-      <w:r>
-        <w:rPr>
-          <w:lang w:val="sr-Latn-RS"/>
-        </w:rPr>
-        <w:lastRenderedPageBreak/>
+      <w:bookmarkStart w:id="10" w:name="_Toc205845221"/>
+      <w:r>
+        <w:rPr>
+          <w:lang w:val="sr-Latn-RS"/>
+        </w:rPr>
         <w:t>Posebni zahtevi</w:t>
       </w:r>
-      <w:bookmarkEnd w:id="9"/>
+      <w:bookmarkEnd w:id="10"/>
       <w:r>
         <w:rPr>
           <w:lang w:val="sr-Latn-RS"/>
@@ -3971,14 +4322,14 @@
           <w:lang w:val="sr-Latn-RS"/>
         </w:rPr>
       </w:pPr>
-      <w:bookmarkStart w:id="10" w:name="_Toc205843931"/>
+      <w:bookmarkStart w:id="11" w:name="_Toc205845222"/>
       <w:r>
         <w:rPr>
           <w:lang w:val="sr-Latn-RS"/>
         </w:rPr>
         <w:t>Preduslovi</w:t>
       </w:r>
-      <w:bookmarkEnd w:id="10"/>
+      <w:bookmarkEnd w:id="11"/>
       <w:r>
         <w:rPr>
           <w:lang w:val="sr-Latn-RS"/>
@@ -4043,14 +4394,14 @@
           <w:lang w:val="sr-Latn-RS"/>
         </w:rPr>
       </w:pPr>
-      <w:bookmarkStart w:id="11" w:name="_Toc205843932"/>
+      <w:bookmarkStart w:id="12" w:name="_Toc205845223"/>
       <w:r>
         <w:rPr>
           <w:lang w:val="sr-Latn-RS"/>
         </w:rPr>
         <w:t>Posledice</w:t>
       </w:r>
-      <w:bookmarkEnd w:id="11"/>
+      <w:bookmarkEnd w:id="12"/>
       <w:r>
         <w:rPr>
           <w:lang w:val="sr-Latn-RS"/>

</xml_diff>